<commit_message>
Migrate to vinoo1985/heart-disease-mlops; regenerate report (32 links)
</commit_message>
<xml_diff>
--- a/reports/MLOps_Assignment1_Report.docx
+++ b/reports/MLOps_Assignment1_Report.docx
@@ -122,7 +122,7 @@
           <w:color w:val="555555"/>
           <w:sz w:val="24"/>
         </w:rPr>
-        <w:t xml:space="preserve"> 2025cs05050-rgb</w:t>
+        <w:t xml:space="preserve"> 2025cs05050</w:t>
       </w:r>
     </w:p>
     <w:p>
@@ -145,7 +145,7 @@
           <w:color w:val="555555"/>
           <w:sz w:val="24"/>
         </w:rPr>
-        <w:t xml:space="preserve"> https://github.com/2025cs05050-rgb/heart-disease-mlops</w:t>
+        <w:t xml:space="preserve"> https://github.com/vinoo1985/heart-disease-mlops</w:t>
       </w:r>
     </w:p>
     <w:p/>
@@ -160,7 +160,7 @@
           <w:color w:val="555555"/>
           <w:sz w:val="24"/>
         </w:rPr>
-        <w:t>Date: 2026-05-08</w:t>
+        <w:t>Date: 2026-05-09</w:t>
       </w:r>
     </w:p>
     <w:p/>
@@ -5847,7 +5847,7 @@
             <w:u w:val="single"/>
             <w:sz w:val="21"/>
           </w:rPr>
-          <w:t xml:space="preserve">https://github.com/2025cs05050-rgb/heart-disease-mlops</w:t>
+          <w:t xml:space="preserve">https://github.com/vinoo1985/heart-disease-mlops</w:t>
         </w:r>
       </w:hyperlink>
     </w:p>
@@ -5896,7 +5896,7 @@
             <w:u w:val="single"/>
             <w:sz w:val="21"/>
           </w:rPr>
-          <w:t xml:space="preserve">https://github.com/2025cs05050-rgb/heart-disease-mlops/blob/main/notebooks/01_eda.ipynb</w:t>
+          <w:t xml:space="preserve">https://github.com/vinoo1985/heart-disease-mlops/blob/main/notebooks/01_eda.ipynb</w:t>
         </w:r>
       </w:hyperlink>
       <w:r>
@@ -5914,7 +5914,7 @@
             <w:u w:val="single"/>
             <w:sz w:val="21"/>
           </w:rPr>
-          <w:t xml:space="preserve">https://github.com/2025cs05050-rgb/heart-disease-mlops/blob/main/reports/01_Exploratory_Data_Analysis.pdf</w:t>
+          <w:t xml:space="preserve">https://github.com/vinoo1985/heart-disease-mlops/blob/main/reports/01_Exploratory_Data_Analysis.pdf</w:t>
         </w:r>
       </w:hyperlink>
     </w:p>
@@ -5949,7 +5949,7 @@
             <w:u w:val="single"/>
             <w:sz w:val="21"/>
           </w:rPr>
-          <w:t xml:space="preserve">https://github.com/2025cs05050-rgb/heart-disease-mlops/blob/main/notebooks/02_preprocessing.ipynb</w:t>
+          <w:t xml:space="preserve">https://github.com/vinoo1985/heart-disease-mlops/blob/main/notebooks/02_preprocessing.ipynb</w:t>
         </w:r>
       </w:hyperlink>
       <w:r>
@@ -5967,7 +5967,7 @@
             <w:u w:val="single"/>
             <w:sz w:val="21"/>
           </w:rPr>
-          <w:t xml:space="preserve">https://github.com/2025cs05050-rgb/heart-disease-mlops/blob/main/reports/02_Preprocessing.pdf</w:t>
+          <w:t xml:space="preserve">https://github.com/vinoo1985/heart-disease-mlops/blob/main/reports/02_Preprocessing.pdf</w:t>
         </w:r>
       </w:hyperlink>
     </w:p>
@@ -6002,7 +6002,7 @@
             <w:u w:val="single"/>
             <w:sz w:val="21"/>
           </w:rPr>
-          <w:t xml:space="preserve">https://github.com/2025cs05050-rgb/heart-disease-mlops/blob/main/notebooks/03_model_training.ipynb</w:t>
+          <w:t xml:space="preserve">https://github.com/vinoo1985/heart-disease-mlops/blob/main/notebooks/03_model_training.ipynb</w:t>
         </w:r>
       </w:hyperlink>
       <w:r>
@@ -6020,7 +6020,7 @@
             <w:u w:val="single"/>
             <w:sz w:val="21"/>
           </w:rPr>
-          <w:t xml:space="preserve">https://github.com/2025cs05050-rgb/heart-disease-mlops/blob/main/reports/03_Model_Training.pdf</w:t>
+          <w:t xml:space="preserve">https://github.com/vinoo1985/heart-disease-mlops/blob/main/reports/03_Model_Training.pdf</w:t>
         </w:r>
       </w:hyperlink>
     </w:p>
@@ -6055,7 +6055,7 @@
             <w:u w:val="single"/>
             <w:sz w:val="21"/>
           </w:rPr>
-          <w:t xml:space="preserve">https://github.com/2025cs05050-rgb/heart-disease-mlops/blob/main/notebooks/04_inference.ipynb</w:t>
+          <w:t xml:space="preserve">https://github.com/vinoo1985/heart-disease-mlops/blob/main/notebooks/04_inference.ipynb</w:t>
         </w:r>
       </w:hyperlink>
       <w:r>
@@ -6073,7 +6073,7 @@
             <w:u w:val="single"/>
             <w:sz w:val="21"/>
           </w:rPr>
-          <w:t xml:space="preserve">https://github.com/2025cs05050-rgb/heart-disease-mlops/blob/main/reports/04_Inference.pdf</w:t>
+          <w:t xml:space="preserve">https://github.com/vinoo1985/heart-disease-mlops/blob/main/reports/04_Inference.pdf</w:t>
         </w:r>
       </w:hyperlink>
     </w:p>
@@ -6108,7 +6108,7 @@
             <w:u w:val="single"/>
             <w:sz w:val="21"/>
           </w:rPr>
-          <w:t xml:space="preserve">https://github.com/2025cs05050-rgb/heart-disease-mlops/blob/main/notebooks/05_containerisation.ipynb</w:t>
+          <w:t xml:space="preserve">https://github.com/vinoo1985/heart-disease-mlops/blob/main/notebooks/05_containerisation.ipynb</w:t>
         </w:r>
       </w:hyperlink>
       <w:r>
@@ -6126,7 +6126,7 @@
             <w:u w:val="single"/>
             <w:sz w:val="21"/>
           </w:rPr>
-          <w:t xml:space="preserve">https://github.com/2025cs05050-rgb/heart-disease-mlops/blob/main/reports/05_Containerisation.pdf</w:t>
+          <w:t xml:space="preserve">https://github.com/vinoo1985/heart-disease-mlops/blob/main/reports/05_Containerisation.pdf</w:t>
         </w:r>
       </w:hyperlink>
     </w:p>
@@ -6161,7 +6161,7 @@
             <w:u w:val="single"/>
             <w:sz w:val="21"/>
           </w:rPr>
-          <w:t xml:space="preserve">https://github.com/2025cs05050-rgb/heart-disease-mlops/blob/main/notebooks/06_kubernetes.ipynb</w:t>
+          <w:t xml:space="preserve">https://github.com/vinoo1985/heart-disease-mlops/blob/main/notebooks/06_kubernetes.ipynb</w:t>
         </w:r>
       </w:hyperlink>
       <w:r>
@@ -6179,7 +6179,7 @@
             <w:u w:val="single"/>
             <w:sz w:val="21"/>
           </w:rPr>
-          <w:t xml:space="preserve">https://github.com/2025cs05050-rgb/heart-disease-mlops/blob/main/reports/06_Kubernetes.pdf</w:t>
+          <w:t xml:space="preserve">https://github.com/vinoo1985/heart-disease-mlops/blob/main/reports/06_Kubernetes.pdf</w:t>
         </w:r>
       </w:hyperlink>
     </w:p>
@@ -6214,7 +6214,7 @@
             <w:u w:val="single"/>
             <w:sz w:val="21"/>
           </w:rPr>
-          <w:t xml:space="preserve">https://github.com/2025cs05050-rgb/heart-disease-mlops/blob/main/notebooks/07_monitoring.ipynb</w:t>
+          <w:t xml:space="preserve">https://github.com/vinoo1985/heart-disease-mlops/blob/main/notebooks/07_monitoring.ipynb</w:t>
         </w:r>
       </w:hyperlink>
       <w:r>
@@ -6232,7 +6232,7 @@
             <w:u w:val="single"/>
             <w:sz w:val="21"/>
           </w:rPr>
-          <w:t xml:space="preserve">https://github.com/2025cs05050-rgb/heart-disease-mlops/blob/main/reports/07_Monitoring.pdf</w:t>
+          <w:t xml:space="preserve">https://github.com/vinoo1985/heart-disease-mlops/blob/main/reports/07_Monitoring.pdf</w:t>
         </w:r>
       </w:hyperlink>
     </w:p>

</xml_diff>

<commit_message>
report: replace synthetic Grafana mockup with live Killercoda dashboard screenshot (Fig 5)
</commit_message>
<xml_diff>
--- a/reports/MLOps_Assignment1_Report.docx
+++ b/reports/MLOps_Assignment1_Report.docx
@@ -160,7 +160,7 @@
           <w:color w:val="555555"/>
           <w:sz w:val="24"/>
         </w:rPr>
-        <w:t>Date: 2026-05-09</w:t>
+        <w:t>Date: 2026-05-10</w:t>
       </w:r>
     </w:p>
     <w:p/>
@@ -3741,7 +3741,7 @@
       <w:r>
         <w:drawing>
           <wp:inline xmlns:a="http://schemas.openxmlformats.org/drawingml/2006/main" xmlns:pic="http://schemas.openxmlformats.org/drawingml/2006/picture">
-            <wp:extent cx="5760000" cy="3432620"/>
+            <wp:extent cx="5760000" cy="3705152"/>
             <wp:docPr id="5" name="Picture 5"/>
             <wp:cNvGraphicFramePr>
               <a:graphicFrameLocks noChangeAspect="1"/>
@@ -3762,7 +3762,7 @@
                   <pic:spPr>
                     <a:xfrm>
                       <a:off x="0" y="0"/>
-                      <a:ext cx="5760000" cy="3432620"/>
+                      <a:ext cx="5760000" cy="3705152"/>
                     </a:xfrm>
                     <a:prstGeom prst="rect"/>
                   </pic:spPr>
@@ -3785,7 +3785,7 @@
           <w:color w:val="555555"/>
           <w:sz w:val="18"/>
         </w:rPr>
-        <w:t>Figure 5 — Pre-provisioned Grafana dashboard ML › Heart Disease API: stat row, request rate, latency percentiles, class balance and HTTP status codes.</w:t>
+        <w:t>Figure 5 — Live Grafana dashboard 'Heart Disease API' rendered from Prometheus scrapes of the Killercoda cluster: request rate by endpoint, latency percentiles, predictions by class, predicted-probability distribution and HTTP status codes.</w:t>
       </w:r>
     </w:p>
     <w:p>
@@ -5051,7 +5051,7 @@
           <w:rFonts w:ascii="Calibri" w:hAnsi="Calibri"/>
           <w:sz w:val="21"/>
         </w:rPr>
-        <w:t xml:space="preserve"> Figures 3-5 (MLflow, Swagger, Grafana) are programmatically rendered reproductions of the respective UIs, produced by </w:t>
+        <w:t xml:space="preserve"> Figures 3-4 (MLflow, Swagger) are programmatically rendered reproductions of the respective UIs, produced by </w:t>
       </w:r>
       <w:r>
         <w:rPr>
@@ -5079,21 +5079,7 @@
           <w:rFonts w:ascii="Calibri" w:hAnsi="Calibri"/>
           <w:sz w:val="21"/>
         </w:rPr>
-        <w:t xml:space="preserve"> and the panel layout in </w:t>
-      </w:r>
-      <w:r>
-        <w:rPr>
-          <w:rFonts w:ascii="Consolas" w:hAnsi="Consolas"/>
-          <w:sz w:val="21"/>
-        </w:rPr>
-        <w:t>monitoring/grafana/dashboards/heart-disease-api.json</w:t>
-      </w:r>
-      <w:r>
-        <w:rPr>
-          <w:rFonts w:ascii="Calibri" w:hAnsi="Calibri"/>
-          <w:sz w:val="21"/>
-        </w:rPr>
-        <w:t xml:space="preserve">. Figures 6-12 in §12 are </w:t>
+        <w:t xml:space="preserve">. Figure 5 (Grafana) and Figures 6-12 in §12 are </w:t>
       </w:r>
       <w:r>
         <w:rPr>
@@ -5108,7 +5094,7 @@
           <w:rFonts w:ascii="Calibri" w:hAnsi="Calibri"/>
           <w:sz w:val="21"/>
         </w:rPr>
-        <w:t xml:space="preserve"> captured from the live two-node Kubernetes cluster on Killercoda.</w:t>
+        <w:t xml:space="preserve"> captured from the live Kubernetes cluster on Killercoda.</w:t>
       </w:r>
     </w:p>
     <w:p>
@@ -6711,7 +6697,7 @@
           <w:rFonts w:ascii="Calibri" w:hAnsi="Calibri"/>
           <w:sz w:val="21"/>
         </w:rPr>
-        <w:t xml:space="preserve"> — seven Killercoda deployment screenshots embedded as Figures 6-12.</w:t>
+        <w:t xml:space="preserve"> — eight Killercoda deployment screenshots (terminal captures + live Grafana dashboard) embedded as Figures 6-13.</w:t>
       </w:r>
     </w:p>
     <w:sectPr>

</xml_diff>